<commit_message>
Finalize PR&P perspective upload package
</commit_message>
<xml_diff>
--- a/manuscript/submission/title-page.docx
+++ b/manuscript/submission/title-page.docx
@@ -29,7 +29,7 @@
         <w:t>Article type:</w:t>
       </w:r>
       <w:r>
-        <w:t xml:space="preserve"> Review article (evidence-based pharmacological perspective)</w:t>
+        <w:t xml:space="preserve"> Perspective article (evidence-based pharmacological perspective)</w:t>
       </w:r>
     </w:p>
     <w:p/>
@@ -125,12 +125,12 @@
         <w:t>Tables and supporting data:</w:t>
       </w:r>
       <w:r>
-        <w:t xml:space="preserve"> One machine-readable claims–terpene matrix and</w:t>
+        <w:t xml:space="preserve"> Supporting Information Tables S1–S4 are supplied</w:t>
       </w:r>
     </w:p>
     <w:p>
       <w:r>
-        <w:t>one prioritized hypotheses-to-test table are supplied as supporting data.</w:t>
+        <w:t>as editable, machine-readable CSV files with legends in the submission package.</w:t>
       </w:r>
     </w:p>
     <w:p/>

</xml_diff>

<commit_message>
Resolve author metadata placeholders
</commit_message>
<xml_diff>
--- a/manuscript/submission/title-page.docx
+++ b/manuscript/submission/title-page.docx
@@ -65,7 +65,7 @@
         <w:t>Corresponding author:</w:t>
       </w:r>
       <w:r>
-        <w:t xml:space="preserve"> [NAME, POSTAL ADDRESS, TELEPHONE, INSTITUTIONAL EMAIL]</w:t>
+        <w:t xml:space="preserve"> Daniel C. McShan — [POSTAL ADDRESS, TELEPHONE, INSTITUTIONAL EMAIL]</w:t>
       </w:r>
     </w:p>
     <w:p/>
@@ -175,7 +175,7 @@
         <w:t>Corresponding author contact:</w:t>
       </w:r>
       <w:r>
-        <w:t xml:space="preserve"> [NAME, POSTAL ADDRESS, TELEPHONE, INSTITUTIONAL EMAIL]</w:t>
+        <w:t xml:space="preserve"> Daniel C. McShan — [POSTAL ADDRESS, TELEPHONE, INSTITUTIONAL EMAIL]</w:t>
       </w:r>
     </w:p>
     <w:p/>

</xml_diff>

<commit_message>
Complete confirmed author contact metadata
</commit_message>
<xml_diff>
--- a/manuscript/submission/title-page.docx
+++ b/manuscript/submission/title-page.docx
@@ -53,7 +53,7 @@
         <w:t>Affiliations:</w:t>
       </w:r>
       <w:r>
-        <w:t xml:space="preserve"> Daniel C. McShan, Terpedia, LLC; Susan Trapp, [AFFILIATION TO CONFIRM]</w:t>
+        <w:t xml:space="preserve"> Daniel C. McShan and Susan Trapp, Terpedia, LLC</w:t>
       </w:r>
     </w:p>
     <w:p/>
@@ -65,7 +65,7 @@
         <w:t>Corresponding author:</w:t>
       </w:r>
       <w:r>
-        <w:t xml:space="preserve"> Daniel C. McShan — 21085 Capella Dr, Monument, CO 80132; telephone [TO CONFIRM]; dan@terpedia.com</w:t>
+        <w:t xml:space="preserve"> Daniel C. McShan — 21085 Capella Dr, Monument, CO 80132; telephone 720-635-9842; dan@terpedia.com</w:t>
       </w:r>
     </w:p>
     <w:p/>
@@ -178,7 +178,7 @@
         <w:t>Corresponding author contact:</w:t>
       </w:r>
       <w:r>
-        <w:t xml:space="preserve"> Daniel C. McShan — 21085 Capella Dr, Monument, CO 80132; telephone [TO CONFIRM]; dan@terpedia.com</w:t>
+        <w:t xml:space="preserve"> Daniel C. McShan — 21085 Capella Dr, Monument, CO 80132; telephone 720-635-9842; dan@terpedia.com</w:t>
       </w:r>
     </w:p>
     <w:p/>

</xml_diff>

<commit_message>
Correct Susan Trapp CRediT contribution
</commit_message>
<xml_diff>
--- a/manuscript/submission/title-page.docx
+++ b/manuscript/submission/title-page.docx
@@ -460,12 +460,12 @@
     </w:p>
     <w:p>
       <w:r>
-        <w:t>original draft, and writing—review and editing. Susan Trapp: Conceptualization,</w:t>
+        <w:t>original draft, and writing—review and editing. Susan Trapp: writing—review and</w:t>
       </w:r>
     </w:p>
     <w:p>
       <w:r>
-        <w:t>investigation, and writing—review and editing [TO CONFIRM BY BOTH AUTHORS].</w:t>
+        <w:t>editing [TO CONFIRM BY BOTH AUTHORS].</w:t>
       </w:r>
     </w:p>
     <w:p/>

</xml_diff>